<commit_message>
docs: update core formula notes
</commit_message>
<xml_diff>
--- a/Reinforcement learning/核心公式说明.docx
+++ b/Reinforcement learning/核心公式说明.docx
@@ -71,9 +71,6 @@
       <w:pPr>
         <w:pStyle w:val="a9"/>
         <w:ind w:left="360"/>
-        <w:rPr>
-          <w:rFonts w:hint="eastAsia"/>
-        </w:rPr>
       </w:pPr>
       <w:r>
         <w:rPr>
@@ -237,7 +234,7 @@
           <v:shape id="_x0000_i1025" type="#_x0000_t75" style="width:9.1pt;height:14.15pt" o:ole="">
             <v:imagedata r:id="rId8" o:title=""/>
           </v:shape>
-          <o:OLEObject Type="Embed" ProgID="Equation.DSMT4" ShapeID="_x0000_i1025" DrawAspect="Content" ObjectID="_1837842378" r:id="rId9"/>
+          <o:OLEObject Type="Embed" ProgID="Equation.DSMT4" ShapeID="_x0000_i1025" DrawAspect="Content" ObjectID="_1837848763" r:id="rId9"/>
         </w:object>
       </w:r>
       <w:r>
@@ -248,7 +245,7 @@
           <v:shape id="_x0000_i1026" type="#_x0000_t75" style="width:106.2pt;height:18.25pt" o:ole="">
             <v:imagedata r:id="rId10" o:title=""/>
           </v:shape>
-          <o:OLEObject Type="Embed" ProgID="Equation.DSMT4" ShapeID="_x0000_i1026" DrawAspect="Content" ObjectID="_1837842379" r:id="rId11"/>
+          <o:OLEObject Type="Embed" ProgID="Equation.DSMT4" ShapeID="_x0000_i1026" DrawAspect="Content" ObjectID="_1837848764" r:id="rId11"/>
         </w:object>
       </w:r>
     </w:p>
@@ -265,7 +262,7 @@
           <v:shape id="_x0000_i1027" type="#_x0000_t75" style="width:150.85pt;height:18.25pt" o:ole="">
             <v:imagedata r:id="rId12" o:title=""/>
           </v:shape>
-          <o:OLEObject Type="Embed" ProgID="Equation.DSMT4" ShapeID="_x0000_i1027" DrawAspect="Content" ObjectID="_1837842380" r:id="rId13"/>
+          <o:OLEObject Type="Embed" ProgID="Equation.DSMT4" ShapeID="_x0000_i1027" DrawAspect="Content" ObjectID="_1837848765" r:id="rId13"/>
         </w:object>
       </w:r>
     </w:p>
@@ -273,9 +270,6 @@
       <w:pPr>
         <w:pStyle w:val="a9"/>
         <w:ind w:left="360"/>
-        <w:rPr>
-          <w:rFonts w:hint="eastAsia"/>
-        </w:rPr>
       </w:pPr>
       <w:r>
         <w:rPr>
@@ -447,7 +441,7 @@
           <v:shape id="_x0000_i1028" type="#_x0000_t75" style="width:219.2pt;height:27.8pt" o:ole="">
             <v:imagedata r:id="rId14" o:title=""/>
           </v:shape>
-          <o:OLEObject Type="Embed" ProgID="Equation.DSMT4" ShapeID="_x0000_i1028" DrawAspect="Content" ObjectID="_1837842381" r:id="rId15"/>
+          <o:OLEObject Type="Embed" ProgID="Equation.DSMT4" ShapeID="_x0000_i1028" DrawAspect="Content" ObjectID="_1837848766" r:id="rId15"/>
         </w:object>
       </w:r>
     </w:p>
@@ -464,7 +458,7 @@
           <v:shape id="_x0000_i1029" type="#_x0000_t75" style="width:252.9pt;height:36pt" o:ole="">
             <v:imagedata r:id="rId16" o:title=""/>
           </v:shape>
-          <o:OLEObject Type="Embed" ProgID="Equation.DSMT4" ShapeID="_x0000_i1029" DrawAspect="Content" ObjectID="_1837842382" r:id="rId17"/>
+          <o:OLEObject Type="Embed" ProgID="Equation.DSMT4" ShapeID="_x0000_i1029" DrawAspect="Content" ObjectID="_1837848767" r:id="rId17"/>
         </w:object>
       </w:r>
     </w:p>
@@ -681,9 +675,6 @@
       <w:pPr>
         <w:pStyle w:val="a9"/>
         <w:ind w:left="360" w:firstLineChars="800" w:firstLine="2240"/>
-        <w:rPr>
-          <w:rFonts w:hint="eastAsia"/>
-        </w:rPr>
       </w:pPr>
       <w:r>
         <w:rPr>
@@ -693,7 +684,7 @@
           <v:shape id="_x0000_i1030" type="#_x0000_t75" style="width:186.85pt;height:97.95pt" o:ole="">
             <v:imagedata r:id="rId18" o:title=""/>
           </v:shape>
-          <o:OLEObject Type="Embed" ProgID="Equation.DSMT4" ShapeID="_x0000_i1030" DrawAspect="Content" ObjectID="_1837842383" r:id="rId19"/>
+          <o:OLEObject Type="Embed" ProgID="Equation.DSMT4" ShapeID="_x0000_i1030" DrawAspect="Content" ObjectID="_1837848768" r:id="rId19"/>
         </w:object>
       </w:r>
     </w:p>
@@ -749,7 +740,7 @@
           <v:shape id="_x0000_i1031" type="#_x0000_t75" style="width:165.85pt;height:18.25pt" o:ole="">
             <v:imagedata r:id="rId20" o:title=""/>
           </v:shape>
-          <o:OLEObject Type="Embed" ProgID="Equation.DSMT4" ShapeID="_x0000_i1031" DrawAspect="Content" ObjectID="_1837842384" r:id="rId21"/>
+          <o:OLEObject Type="Embed" ProgID="Equation.DSMT4" ShapeID="_x0000_i1031" DrawAspect="Content" ObjectID="_1837848769" r:id="rId21"/>
         </w:object>
       </w:r>
     </w:p>
@@ -766,7 +757,7 @@
           <v:shape id="_x0000_i1032" type="#_x0000_t75" style="width:211pt;height:18.25pt" o:ole="">
             <v:imagedata r:id="rId22" o:title=""/>
           </v:shape>
-          <o:OLEObject Type="Embed" ProgID="Equation.DSMT4" ShapeID="_x0000_i1032" DrawAspect="Content" ObjectID="_1837842385" r:id="rId23"/>
+          <o:OLEObject Type="Embed" ProgID="Equation.DSMT4" ShapeID="_x0000_i1032" DrawAspect="Content" ObjectID="_1837848770" r:id="rId23"/>
         </w:object>
       </w:r>
     </w:p>
@@ -840,7 +831,7 @@
           <v:shape id="_x0000_i1033" type="#_x0000_t75" style="width:225.1pt;height:20.05pt" o:ole="">
             <v:imagedata r:id="rId24" o:title=""/>
           </v:shape>
-          <o:OLEObject Type="Embed" ProgID="Equation.DSMT4" ShapeID="_x0000_i1033" DrawAspect="Content" ObjectID="_1837842386" r:id="rId25"/>
+          <o:OLEObject Type="Embed" ProgID="Equation.DSMT4" ShapeID="_x0000_i1033" DrawAspect="Content" ObjectID="_1837848771" r:id="rId25"/>
         </w:object>
       </w:r>
     </w:p>
@@ -983,16 +974,13 @@
           <v:shape id="_x0000_i1034" type="#_x0000_t75" style="width:309.85pt;height:20.05pt" o:ole="">
             <v:imagedata r:id="rId26" o:title=""/>
           </v:shape>
-          <o:OLEObject Type="Embed" ProgID="Equation.DSMT4" ShapeID="_x0000_i1034" DrawAspect="Content" ObjectID="_1837842387" r:id="rId27"/>
+          <o:OLEObject Type="Embed" ProgID="Equation.DSMT4" ShapeID="_x0000_i1034" DrawAspect="Content" ObjectID="_1837848772" r:id="rId27"/>
         </w:object>
       </w:r>
     </w:p>
     <w:p>
       <w:pPr>
         <w:ind w:left="560" w:hangingChars="200" w:hanging="560"/>
-        <w:rPr>
-          <w:rFonts w:hint="eastAsia"/>
-        </w:rPr>
       </w:pPr>
       <w:r>
         <w:rPr>
@@ -1139,7 +1127,7 @@
           <v:shape id="_x0000_i1035" type="#_x0000_t75" style="width:25.05pt;height:18.25pt" o:ole="">
             <v:imagedata r:id="rId28" o:title=""/>
           </v:shape>
-          <o:OLEObject Type="Embed" ProgID="Equation.DSMT4" ShapeID="_x0000_i1035" DrawAspect="Content" ObjectID="_1837842388" r:id="rId29"/>
+          <o:OLEObject Type="Embed" ProgID="Equation.DSMT4" ShapeID="_x0000_i1035" DrawAspect="Content" ObjectID="_1837848773" r:id="rId29"/>
         </w:object>
       </w:r>
       <w:r>
@@ -1194,7 +1182,7 @@
           <v:shape id="_x0000_i1036" type="#_x0000_t75" style="width:240.15pt;height:70.2pt" o:ole="">
             <v:imagedata r:id="rId30" o:title=""/>
           </v:shape>
-          <o:OLEObject Type="Embed" ProgID="Equation.DSMT4" ShapeID="_x0000_i1036" DrawAspect="Content" ObjectID="_1837842389" r:id="rId31"/>
+          <o:OLEObject Type="Embed" ProgID="Equation.DSMT4" ShapeID="_x0000_i1036" DrawAspect="Content" ObjectID="_1837848774" r:id="rId31"/>
         </w:object>
       </w:r>
     </w:p>
@@ -1349,11 +1337,6 @@
       </w:r>
     </w:p>
     <w:p>
-      <w:pPr>
-        <w:rPr>
-          <w:rFonts w:hint="eastAsia"/>
-        </w:rPr>
-      </w:pPr>
       <w:r>
         <w:rPr>
           <w:rFonts w:hint="eastAsia"/>
@@ -1419,12 +1402,46 @@
         <w:t>action value)</w:t>
       </w:r>
     </w:p>
+    <w:p/>
+    <w:p/>
+    <w:p/>
+    <w:p/>
+    <w:p/>
+    <w:p/>
+    <w:p>
+      <w:pPr>
+        <w:outlineLvl w:val="1"/>
+        <w:rPr>
+          <w:rFonts w:hint="eastAsia"/>
+        </w:rPr>
+      </w:pPr>
+      <w:r>
+        <w:rPr>
+          <w:rFonts w:hint="eastAsia"/>
+        </w:rPr>
+        <w:lastRenderedPageBreak/>
+        <w:t>关于</w:t>
+      </w:r>
+      <w:proofErr w:type="spellStart"/>
+      <w:r>
+        <w:rPr>
+          <w:rFonts w:hint="eastAsia"/>
+        </w:rPr>
+        <w:t>sarsa</w:t>
+      </w:r>
+      <w:proofErr w:type="spellEnd"/>
+      <w:r>
+        <w:rPr>
+          <w:rFonts w:hint="eastAsia"/>
+        </w:rPr>
+        <w:t>的补充</w:t>
+      </w:r>
+    </w:p>
     <w:p>
       <w:r>
         <w:rPr>
           <w:noProof/>
         </w:rPr>
-        <w:lastRenderedPageBreak/>
         <w:drawing>
           <wp:inline distT="0" distB="0" distL="0" distR="0" wp14:anchorId="5195211C" wp14:editId="61240064">
             <wp:extent cx="4578585" cy="3321221"/>
@@ -1580,7 +1597,14 @@
         <w:rPr>
           <w:rFonts w:hint="eastAsia"/>
         </w:rPr>
-        <w:t>第一步，后续交给</w:t>
+        <w:t>第一步，后续交</w:t>
+      </w:r>
+      <w:r>
+        <w:rPr>
+          <w:rFonts w:hint="eastAsia"/>
+        </w:rPr>
+        <w:lastRenderedPageBreak/>
+        <w:t>给</w:t>
       </w:r>
       <w:r>
         <w:rPr>
@@ -1602,16 +1626,10 @@
       </w:r>
     </w:p>
     <w:p>
-      <w:pPr>
-        <w:rPr>
-          <w:rFonts w:hint="eastAsia"/>
-        </w:rPr>
-      </w:pPr>
-      <w:r>
-        <w:rPr>
-          <w:rFonts w:hint="eastAsia"/>
-        </w:rPr>
-        <w:lastRenderedPageBreak/>
+      <w:r>
+        <w:rPr>
+          <w:rFonts w:hint="eastAsia"/>
+        </w:rPr>
         <w:t>(</w:t>
       </w:r>
       <w:r>
@@ -1741,11 +1759,6 @@
       </w:r>
     </w:p>
     <w:p>
-      <w:pPr>
-        <w:rPr>
-          <w:rFonts w:hint="eastAsia"/>
-        </w:rPr>
-      </w:pPr>
       <w:r>
         <w:rPr>
           <w:rFonts w:hint="eastAsia"/>
@@ -1837,6 +1850,799 @@
         </w:rPr>
         <w:t>)</w:t>
       </w:r>
+    </w:p>
+    <w:p/>
+    <w:p>
+      <w:pPr>
+        <w:pStyle w:val="a9"/>
+        <w:numPr>
+          <w:ilvl w:val="0"/>
+          <w:numId w:val="1"/>
+        </w:numPr>
+        <w:ind w:left="357" w:hanging="357"/>
+        <w:outlineLvl w:val="0"/>
+        <w:rPr>
+          <w:rFonts w:hint="eastAsia"/>
+        </w:rPr>
+      </w:pPr>
+      <w:r>
+        <w:rPr>
+          <w:rFonts w:hint="eastAsia"/>
+        </w:rPr>
+        <w:t>上面的求解是基于</w:t>
+      </w:r>
+      <w:r>
+        <w:rPr>
+          <w:rFonts w:hint="eastAsia"/>
+        </w:rPr>
+        <w:t>bellman eq</w:t>
+      </w:r>
+      <w:r>
+        <w:rPr>
+          <w:rFonts w:hint="eastAsia"/>
+        </w:rPr>
+        <w:t>uation</w:t>
+      </w:r>
+      <w:r>
+        <w:rPr>
+          <w:rFonts w:hint="eastAsia"/>
+        </w:rPr>
+        <w:t>的，接下来我们引入</w:t>
+      </w:r>
+      <w:r>
+        <w:rPr>
+          <w:rFonts w:hint="eastAsia"/>
+        </w:rPr>
+        <w:t>bellman optimality equation</w:t>
+      </w:r>
+      <w:r>
+        <w:rPr>
+          <w:rFonts w:hint="eastAsia"/>
+        </w:rPr>
+        <w:t>，下面我展示了</w:t>
+      </w:r>
+      <w:r>
+        <w:rPr>
+          <w:rFonts w:hint="eastAsia"/>
+        </w:rPr>
+        <w:t xml:space="preserve">model free </w:t>
+      </w:r>
+      <w:r>
+        <w:rPr>
+          <w:rFonts w:hint="eastAsia"/>
+        </w:rPr>
+        <w:t>与</w:t>
+      </w:r>
+      <w:r>
+        <w:rPr>
+          <w:rFonts w:hint="eastAsia"/>
+        </w:rPr>
+        <w:t xml:space="preserve">model base </w:t>
+      </w:r>
+      <w:r>
+        <w:rPr>
+          <w:rFonts w:hint="eastAsia"/>
+        </w:rPr>
+        <w:t>形式的</w:t>
+      </w:r>
+      <w:r>
+        <w:rPr>
+          <w:rFonts w:hint="eastAsia"/>
+        </w:rPr>
+        <w:t xml:space="preserve">bellman </w:t>
+      </w:r>
+      <w:r>
+        <w:rPr>
+          <w:rFonts w:hint="eastAsia"/>
+        </w:rPr>
+        <w:t>optimality equation</w:t>
+      </w:r>
+      <w:r>
+        <w:rPr>
+          <w:rFonts w:hint="eastAsia"/>
+        </w:rPr>
+        <w:t>,</w:t>
+      </w:r>
+      <w:r>
+        <w:rPr>
+          <w:rFonts w:hint="eastAsia"/>
+        </w:rPr>
+        <w:t>以及</w:t>
+      </w:r>
+      <w:r>
+        <w:rPr>
+          <w:rFonts w:hint="eastAsia"/>
+        </w:rPr>
+        <w:t>bellman eq</w:t>
+      </w:r>
+      <w:r>
+        <w:rPr>
+          <w:rFonts w:hint="eastAsia"/>
+        </w:rPr>
+        <w:t>uation</w:t>
+      </w:r>
+    </w:p>
+    <w:p>
+      <w:pPr>
+        <w:pStyle w:val="a9"/>
+        <w:ind w:left="2037" w:firstLine="63"/>
+        <w:rPr>
+          <w:rFonts w:hint="eastAsia"/>
+        </w:rPr>
+      </w:pPr>
+      <w:r>
+        <w:rPr>
+          <w:position w:val="-12"/>
+        </w:rPr>
+        <w:object w:dxaOrig="1840" w:dyaOrig="360" w14:anchorId="1CCBC852">
+          <v:shape id="_x0000_i1039" type="#_x0000_t75" style="width:92.05pt;height:18.25pt" o:ole="">
+            <v:imagedata r:id="rId36" o:title=""/>
+          </v:shape>
+          <o:OLEObject Type="Embed" ProgID="Equation.DSMT4" ShapeID="_x0000_i1039" DrawAspect="Content" ObjectID="_1837848775" r:id="rId37"/>
+        </w:object>
+      </w:r>
+      <w:r>
+        <w:rPr>
+          <w:rFonts w:hint="eastAsia"/>
+        </w:rPr>
+        <w:t xml:space="preserve"> </w:t>
+      </w:r>
+    </w:p>
+    <w:p>
+      <w:pPr>
+        <w:pStyle w:val="a9"/>
+        <w:ind w:left="2037" w:firstLine="63"/>
+      </w:pPr>
+      <w:r>
+        <w:rPr>
+          <w:position w:val="-14"/>
+        </w:rPr>
+        <w:object w:dxaOrig="4400" w:dyaOrig="400" w14:anchorId="1FB0B466">
+          <v:shape id="_x0000_i1051" type="#_x0000_t75" style="width:220.1pt;height:20.05pt" o:ole="">
+            <v:imagedata r:id="rId38" o:title=""/>
+          </v:shape>
+          <o:OLEObject Type="Embed" ProgID="Equation.DSMT4" ShapeID="_x0000_i1051" DrawAspect="Content" ObjectID="_1837848776" r:id="rId39"/>
+        </w:object>
+      </w:r>
+    </w:p>
+    <w:p>
+      <w:pPr>
+        <w:pStyle w:val="a9"/>
+        <w:ind w:left="2037" w:firstLine="63"/>
+      </w:pPr>
+      <w:r>
+        <w:rPr>
+          <w:position w:val="-30"/>
+        </w:rPr>
+        <w:object w:dxaOrig="3879" w:dyaOrig="560" w14:anchorId="7CF8AF02">
+          <v:shape id="_x0000_i1085" type="#_x0000_t75" style="width:194.15pt;height:27.8pt" o:ole="">
+            <v:imagedata r:id="rId40" o:title=""/>
+          </v:shape>
+          <o:OLEObject Type="Embed" ProgID="Equation.DSMT4" ShapeID="_x0000_i1085" DrawAspect="Content" ObjectID="_1837848777" r:id="rId41"/>
+        </w:object>
+      </w:r>
+    </w:p>
+    <w:p>
+      <w:pPr>
+        <w:pStyle w:val="a9"/>
+        <w:ind w:left="2037" w:firstLine="63"/>
+      </w:pPr>
+      <w:r>
+        <w:rPr>
+          <w:position w:val="-30"/>
+        </w:rPr>
+        <w:object w:dxaOrig="4380" w:dyaOrig="560" w14:anchorId="7DFA3496">
+          <v:shape id="_x0000_i1088" type="#_x0000_t75" style="width:219.2pt;height:27.8pt" o:ole="">
+            <v:imagedata r:id="rId42" o:title=""/>
+          </v:shape>
+          <o:OLEObject Type="Embed" ProgID="Equation.DSMT4" ShapeID="_x0000_i1088" DrawAspect="Content" ObjectID="_1837848778" r:id="rId43"/>
+        </w:object>
+      </w:r>
+    </w:p>
+    <w:p>
+      <w:pPr>
+        <w:pStyle w:val="a9"/>
+        <w:ind w:left="2037" w:firstLine="63"/>
+        <w:rPr>
+          <w:rFonts w:hint="eastAsia"/>
+        </w:rPr>
+      </w:pPr>
+    </w:p>
+    <w:p>
+      <w:pPr>
+        <w:pStyle w:val="a9"/>
+        <w:ind w:left="2037" w:firstLine="63"/>
+        <w:rPr>
+          <w:rFonts w:hint="eastAsia"/>
+        </w:rPr>
+      </w:pPr>
+      <w:r>
+        <w:rPr>
+          <w:position w:val="-14"/>
+        </w:rPr>
+        <w:object w:dxaOrig="5000" w:dyaOrig="400" w14:anchorId="4D0C6C13">
+          <v:shape id="_x0000_i1064" type="#_x0000_t75" style="width:250.2pt;height:20.05pt" o:ole="">
+            <v:imagedata r:id="rId44" o:title=""/>
+          </v:shape>
+          <o:OLEObject Type="Embed" ProgID="Equation.DSMT4" ShapeID="_x0000_i1064" DrawAspect="Content" ObjectID="_1837848779" r:id="rId45"/>
+        </w:object>
+      </w:r>
+    </w:p>
+    <w:p>
+      <w:pPr>
+        <w:pStyle w:val="a9"/>
+        <w:ind w:left="2037" w:firstLine="63"/>
+      </w:pPr>
+      <w:r>
+        <w:rPr>
+          <w:position w:val="-30"/>
+        </w:rPr>
+        <w:object w:dxaOrig="4459" w:dyaOrig="560" w14:anchorId="0A60D8B1">
+          <v:shape id="_x0000_i1096" type="#_x0000_t75" style="width:222.85pt;height:27.8pt" o:ole="">
+            <v:imagedata r:id="rId46" o:title=""/>
+          </v:shape>
+          <o:OLEObject Type="Embed" ProgID="Equation.DSMT4" ShapeID="_x0000_i1096" DrawAspect="Content" ObjectID="_1837848780" r:id="rId47"/>
+        </w:object>
+      </w:r>
+    </w:p>
+    <w:p>
+      <w:pPr>
+        <w:pStyle w:val="a9"/>
+        <w:ind w:left="2037" w:firstLine="63"/>
+      </w:pPr>
+      <w:r>
+        <w:rPr>
+          <w:position w:val="-30"/>
+        </w:rPr>
+        <w:object w:dxaOrig="5060" w:dyaOrig="720" w14:anchorId="5DC7BB68">
+          <v:shape id="_x0000_i1098" type="#_x0000_t75" style="width:252.9pt;height:36pt" o:ole="">
+            <v:imagedata r:id="rId48" o:title=""/>
+          </v:shape>
+          <o:OLEObject Type="Embed" ProgID="Equation.DSMT4" ShapeID="_x0000_i1098" DrawAspect="Content" ObjectID="_1837848781" r:id="rId49"/>
+        </w:object>
+      </w:r>
+    </w:p>
+    <w:p>
+      <w:pPr>
+        <w:rPr>
+          <w:rFonts w:hint="eastAsia"/>
+        </w:rPr>
+      </w:pPr>
+      <w:r>
+        <w:rPr>
+          <w:rFonts w:hint="eastAsia"/>
+        </w:rPr>
+        <w:t>(</w:t>
+      </w:r>
+      <w:r>
+        <w:rPr>
+          <w:rFonts w:hint="eastAsia"/>
+          <w:color w:val="C00000"/>
+        </w:rPr>
+        <w:t>注：</w:t>
+      </w:r>
+      <w:r>
+        <w:rPr>
+          <w:rFonts w:hint="eastAsia"/>
+        </w:rPr>
+        <w:t>这里</w:t>
+      </w:r>
+      <w:r>
+        <w:rPr>
+          <w:rFonts w:hint="eastAsia"/>
+        </w:rPr>
+        <w:t xml:space="preserve">state value </w:t>
+      </w:r>
+      <w:r>
+        <w:rPr>
+          <w:rFonts w:hint="eastAsia"/>
+        </w:rPr>
+        <w:t>有一个很有意思的地方，就是他的公式右边有</w:t>
+      </w:r>
+      <w:r>
+        <w:rPr>
+          <w:rFonts w:hint="eastAsia"/>
+        </w:rPr>
+        <w:t>a,</w:t>
+      </w:r>
+      <w:r>
+        <w:rPr>
+          <w:rFonts w:hint="eastAsia"/>
+        </w:rPr>
+        <w:t>这是因为在最优下必定要选动作！！，原来的</w:t>
+      </w:r>
+      <w:r>
+        <w:rPr>
+          <w:rFonts w:hint="eastAsia"/>
+        </w:rPr>
+        <w:t>bellman equation</w:t>
+      </w:r>
+      <w:r>
+        <w:rPr>
+          <w:rFonts w:hint="eastAsia"/>
+        </w:rPr>
+        <w:t>没有</w:t>
+      </w:r>
+      <w:r>
+        <w:rPr>
+          <w:rFonts w:hint="eastAsia"/>
+        </w:rPr>
+        <w:t>a,</w:t>
+      </w:r>
+      <w:r>
+        <w:rPr>
+          <w:rFonts w:hint="eastAsia"/>
+        </w:rPr>
+        <w:t>因为他取得时平均</w:t>
+      </w:r>
+      <w:r>
+        <w:rPr>
+          <w:rFonts w:hint="eastAsia"/>
+        </w:rPr>
+        <w:t>)</w:t>
+      </w:r>
+    </w:p>
+    <w:p>
+      <w:r>
+        <w:rPr>
+          <w:rFonts w:hint="eastAsia"/>
+        </w:rPr>
+        <w:t>补充：</w:t>
+      </w:r>
+    </w:p>
+    <w:p>
+      <w:r>
+        <w:rPr>
+          <w:position w:val="-28"/>
+        </w:rPr>
+        <w:object w:dxaOrig="3420" w:dyaOrig="540" w14:anchorId="60FCAD11">
+          <v:shape id="_x0000_i1077" type="#_x0000_t75" style="width:170.9pt;height:26.9pt" o:ole="">
+            <v:imagedata r:id="rId50" o:title=""/>
+          </v:shape>
+          <o:OLEObject Type="Embed" ProgID="Equation.DSMT4" ShapeID="_x0000_i1077" DrawAspect="Content" ObjectID="_1837848782" r:id="rId51"/>
+        </w:object>
+      </w:r>
+    </w:p>
+    <w:p>
+      <w:r>
+        <w:rPr>
+          <w:rFonts w:hint="eastAsia"/>
+        </w:rPr>
+        <w:t>书本中是选最优的策略，但其实他在后面做了一个</w:t>
+      </w:r>
+      <w:r>
+        <w:t>greedy</w:t>
+      </w:r>
+      <w:r>
+        <w:rPr>
+          <w:rFonts w:hint="eastAsia"/>
+        </w:rPr>
+        <w:t xml:space="preserve"> </w:t>
+      </w:r>
+      <w:r>
+        <w:t>optimal policy</w:t>
+      </w:r>
+      <w:r>
+        <w:rPr>
+          <w:rFonts w:hint="eastAsia"/>
+        </w:rPr>
+        <w:t>，即在每个状态</w:t>
+      </w:r>
+      <w:r>
+        <w:rPr>
+          <w:rFonts w:hint="eastAsia"/>
+        </w:rPr>
+        <w:t>action value</w:t>
+      </w:r>
+      <w:r>
+        <w:rPr>
+          <w:rFonts w:hint="eastAsia"/>
+        </w:rPr>
+        <w:t>最大的</w:t>
+      </w:r>
+      <w:r>
+        <w:rPr>
+          <w:rFonts w:hint="eastAsia"/>
+        </w:rPr>
+        <w:t>action</w:t>
+      </w:r>
+      <w:r>
+        <w:rPr>
+          <w:rFonts w:hint="eastAsia"/>
+        </w:rPr>
+        <w:t>将其</w:t>
+      </w:r>
+      <w:r>
+        <w:rPr>
+          <w:rFonts w:hint="eastAsia"/>
+        </w:rPr>
+        <w:t>policy probability</w:t>
+      </w:r>
+      <w:r>
+        <w:rPr>
+          <w:rFonts w:hint="eastAsia"/>
+        </w:rPr>
+        <w:t>直接置为</w:t>
+      </w:r>
+      <w:r>
+        <w:rPr>
+          <w:rFonts w:hint="eastAsia"/>
+        </w:rPr>
+        <w:t>1</w:t>
+      </w:r>
+      <w:r>
+        <w:rPr>
+          <w:rFonts w:hint="eastAsia"/>
+        </w:rPr>
+        <w:t>，等价于</w:t>
+      </w:r>
+    </w:p>
+    <w:p>
+      <w:pPr>
+        <w:rPr>
+          <w:rFonts w:hint="eastAsia"/>
+        </w:rPr>
+      </w:pPr>
+      <w:r>
+        <w:rPr>
+          <w:position w:val="-12"/>
+        </w:rPr>
+        <w:object w:dxaOrig="2020" w:dyaOrig="360" w14:anchorId="33CC3AC6">
+          <v:shape id="_x0000_i1080" type="#_x0000_t75" style="width:101.15pt;height:18.25pt" o:ole="">
+            <v:imagedata r:id="rId52" o:title=""/>
+          </v:shape>
+          <o:OLEObject Type="Embed" ProgID="Equation.DSMT4" ShapeID="_x0000_i1080" DrawAspect="Content" ObjectID="_1837848783" r:id="rId53"/>
+        </w:object>
+      </w:r>
+    </w:p>
+    <w:p>
+      <w:pPr>
+        <w:pStyle w:val="a9"/>
+        <w:numPr>
+          <w:ilvl w:val="0"/>
+          <w:numId w:val="1"/>
+        </w:numPr>
+        <w:ind w:left="357" w:hanging="357"/>
+        <w:outlineLvl w:val="0"/>
+      </w:pPr>
+      <w:r>
+        <w:rPr>
+          <w:rFonts w:hint="eastAsia"/>
+        </w:rPr>
+        <w:t>现在我们学习的</w:t>
+      </w:r>
+      <w:r>
+        <w:rPr>
+          <w:rFonts w:hint="eastAsia"/>
+        </w:rPr>
+        <w:t xml:space="preserve">model free </w:t>
+      </w:r>
+      <w:r>
+        <w:rPr>
+          <w:rFonts w:hint="eastAsia"/>
+        </w:rPr>
+        <w:t>中去更新策略的方法都是基于先</w:t>
+      </w:r>
+      <w:r>
+        <w:rPr>
+          <w:rFonts w:hint="eastAsia"/>
+        </w:rPr>
+        <w:t>policy evaluation</w:t>
+      </w:r>
+      <w:r>
+        <w:rPr>
+          <w:rFonts w:hint="eastAsia"/>
+        </w:rPr>
+        <w:t>再进行</w:t>
+      </w:r>
+      <w:r>
+        <w:rPr>
+          <w:rFonts w:hint="eastAsia"/>
+        </w:rPr>
+        <w:t>policy improvement</w:t>
+      </w:r>
+      <w:r>
+        <w:rPr>
+          <w:rFonts w:hint="eastAsia"/>
+        </w:rPr>
+        <w:t>的，</w:t>
+      </w:r>
+      <w:r>
+        <w:rPr>
+          <w:rFonts w:hint="eastAsia"/>
+        </w:rPr>
+        <w:t>基于</w:t>
+      </w:r>
+    </w:p>
+    <w:p>
+      <w:r>
+        <w:rPr>
+          <w:noProof/>
+        </w:rPr>
+        <w:lastRenderedPageBreak/>
+        <w:drawing>
+          <wp:inline distT="0" distB="0" distL="0" distR="0" wp14:anchorId="45BF6914" wp14:editId="5AF6056C">
+            <wp:extent cx="5731510" cy="4250690"/>
+            <wp:effectExtent l="0" t="0" r="2540" b="0"/>
+            <wp:docPr id="149959061" name="图片 1"/>
+            <wp:cNvGraphicFramePr>
+              <a:graphicFrameLocks xmlns:a="http://schemas.openxmlformats.org/drawingml/2006/main" noChangeAspect="1"/>
+            </wp:cNvGraphicFramePr>
+            <a:graphic xmlns:a="http://schemas.openxmlformats.org/drawingml/2006/main">
+              <a:graphicData uri="http://schemas.openxmlformats.org/drawingml/2006/picture">
+                <pic:pic xmlns:pic="http://schemas.openxmlformats.org/drawingml/2006/picture">
+                  <pic:nvPicPr>
+                    <pic:cNvPr id="149959061" name=""/>
+                    <pic:cNvPicPr/>
+                  </pic:nvPicPr>
+                  <pic:blipFill>
+                    <a:blip r:embed="rId54"/>
+                    <a:stretch>
+                      <a:fillRect/>
+                    </a:stretch>
+                  </pic:blipFill>
+                  <pic:spPr>
+                    <a:xfrm>
+                      <a:off x="0" y="0"/>
+                      <a:ext cx="5731510" cy="4250690"/>
+                    </a:xfrm>
+                    <a:prstGeom prst="rect">
+                      <a:avLst/>
+                    </a:prstGeom>
+                  </pic:spPr>
+                </pic:pic>
+              </a:graphicData>
+            </a:graphic>
+          </wp:inline>
+        </w:drawing>
+      </w:r>
+    </w:p>
+    <w:p>
+      <w:r>
+        <w:rPr>
+          <w:rFonts w:hint="eastAsia"/>
+        </w:rPr>
+        <w:t>(</w:t>
+      </w:r>
+      <w:r>
+        <w:rPr>
+          <w:rFonts w:hint="eastAsia"/>
+          <w:color w:val="C00000"/>
+        </w:rPr>
+        <w:t>杂记：</w:t>
+      </w:r>
+      <w:r>
+        <w:rPr>
+          <w:rFonts w:hint="eastAsia"/>
+        </w:rPr>
+        <w:t>我是如何通过</w:t>
+      </w:r>
+      <w:r>
+        <w:rPr>
+          <w:rFonts w:hint="eastAsia"/>
+        </w:rPr>
+        <w:t>policy</w:t>
+      </w:r>
+      <w:r>
+        <w:rPr>
+          <w:rFonts w:hint="eastAsia"/>
+        </w:rPr>
+        <w:t>去生成</w:t>
+      </w:r>
+      <w:r>
+        <w:rPr>
+          <w:rFonts w:hint="eastAsia"/>
+        </w:rPr>
+        <w:t>experience</w:t>
+      </w:r>
+      <w:r>
+        <w:rPr>
+          <w:rFonts w:hint="eastAsia"/>
+        </w:rPr>
+        <w:t>的？？首先</w:t>
+      </w:r>
+      <w:r>
+        <w:rPr>
+          <w:rFonts w:hint="eastAsia"/>
+        </w:rPr>
+        <w:t>policy</w:t>
+      </w:r>
+      <w:r>
+        <w:rPr>
+          <w:rFonts w:hint="eastAsia"/>
+        </w:rPr>
+        <w:t>只能去选取动作，然后</w:t>
+      </w:r>
+      <w:r>
+        <w:rPr>
+          <w:rFonts w:hint="eastAsia"/>
+        </w:rPr>
+        <w:t>agent</w:t>
+      </w:r>
+      <w:r>
+        <w:rPr>
+          <w:rFonts w:hint="eastAsia"/>
+        </w:rPr>
+        <w:t>通过</w:t>
+      </w:r>
+      <w:r>
+        <w:rPr>
+          <w:rFonts w:hint="eastAsia"/>
+        </w:rPr>
+        <w:t>action</w:t>
+      </w:r>
+      <w:r>
+        <w:rPr>
+          <w:rFonts w:hint="eastAsia"/>
+        </w:rPr>
+        <w:t>与环境交互，得到了</w:t>
+      </w:r>
+      <w:r>
+        <w:rPr>
+          <w:rFonts w:hint="eastAsia"/>
+        </w:rPr>
+        <w:t>reward</w:t>
+      </w:r>
+      <w:r>
+        <w:rPr>
+          <w:rFonts w:hint="eastAsia"/>
+        </w:rPr>
+        <w:t>与下一步</w:t>
+      </w:r>
+      <w:r>
+        <w:rPr>
+          <w:rFonts w:hint="eastAsia"/>
+        </w:rPr>
+        <w:t>state,</w:t>
+      </w:r>
+      <w:r>
+        <w:rPr>
+          <w:rFonts w:hint="eastAsia"/>
+        </w:rPr>
+        <w:t>重复就是得到了许多数据</w:t>
+      </w:r>
+      <w:r>
+        <w:rPr>
+          <w:rFonts w:hint="eastAsia"/>
+        </w:rPr>
+        <w:t>)</w:t>
+      </w:r>
+    </w:p>
+    <w:p/>
+    <w:p/>
+    <w:p>
+      <w:r>
+        <w:rPr>
+          <w:rFonts w:hint="eastAsia"/>
+        </w:rPr>
+        <w:t>我现在有个疑问，</w:t>
+      </w:r>
+      <w:r>
+        <w:rPr>
+          <w:rFonts w:hint="eastAsia"/>
+        </w:rPr>
+        <w:t xml:space="preserve">iteration </w:t>
+      </w:r>
+      <w:r>
+        <w:rPr>
+          <w:rFonts w:hint="eastAsia"/>
+        </w:rPr>
+        <w:t>算法不是用于求解</w:t>
+      </w:r>
+      <w:r>
+        <w:rPr>
+          <w:rFonts w:hint="eastAsia"/>
+        </w:rPr>
+        <w:t>bellman equation</w:t>
+      </w:r>
+      <w:r>
+        <w:rPr>
+          <w:rFonts w:hint="eastAsia"/>
+        </w:rPr>
+        <w:t>的吗？？</w:t>
+      </w:r>
+    </w:p>
+    <w:p/>
+    <w:p/>
+    <w:p/>
+    <w:p>
+      <w:r>
+        <w:rPr>
+          <w:noProof/>
+        </w:rPr>
+        <w:lastRenderedPageBreak/>
+        <w:drawing>
+          <wp:inline distT="0" distB="0" distL="0" distR="0" wp14:anchorId="162C7F48" wp14:editId="76103A4A">
+            <wp:extent cx="5731510" cy="4290060"/>
+            <wp:effectExtent l="0" t="0" r="2540" b="0"/>
+            <wp:docPr id="39881538" name="图片 1"/>
+            <wp:cNvGraphicFramePr>
+              <a:graphicFrameLocks xmlns:a="http://schemas.openxmlformats.org/drawingml/2006/main" noChangeAspect="1"/>
+            </wp:cNvGraphicFramePr>
+            <a:graphic xmlns:a="http://schemas.openxmlformats.org/drawingml/2006/main">
+              <a:graphicData uri="http://schemas.openxmlformats.org/drawingml/2006/picture">
+                <pic:pic xmlns:pic="http://schemas.openxmlformats.org/drawingml/2006/picture">
+                  <pic:nvPicPr>
+                    <pic:cNvPr id="39881538" name=""/>
+                    <pic:cNvPicPr/>
+                  </pic:nvPicPr>
+                  <pic:blipFill>
+                    <a:blip r:embed="rId55"/>
+                    <a:stretch>
+                      <a:fillRect/>
+                    </a:stretch>
+                  </pic:blipFill>
+                  <pic:spPr>
+                    <a:xfrm>
+                      <a:off x="0" y="0"/>
+                      <a:ext cx="5731510" cy="4290060"/>
+                    </a:xfrm>
+                    <a:prstGeom prst="rect">
+                      <a:avLst/>
+                    </a:prstGeom>
+                  </pic:spPr>
+                </pic:pic>
+              </a:graphicData>
+            </a:graphic>
+          </wp:inline>
+        </w:drawing>
+      </w:r>
+    </w:p>
+    <w:p/>
+    <w:p>
+      <w:pPr>
+        <w:rPr>
+          <w:rFonts w:hint="eastAsia"/>
+        </w:rPr>
+      </w:pPr>
+      <w:r>
+        <w:rPr>
+          <w:noProof/>
+        </w:rPr>
+        <w:lastRenderedPageBreak/>
+        <w:drawing>
+          <wp:inline distT="0" distB="0" distL="0" distR="0" wp14:anchorId="3E4CB0B9" wp14:editId="0C1FCF0F">
+            <wp:extent cx="5731510" cy="4271010"/>
+            <wp:effectExtent l="0" t="0" r="2540" b="0"/>
+            <wp:docPr id="1500302155" name="图片 1"/>
+            <wp:cNvGraphicFramePr>
+              <a:graphicFrameLocks xmlns:a="http://schemas.openxmlformats.org/drawingml/2006/main" noChangeAspect="1"/>
+            </wp:cNvGraphicFramePr>
+            <a:graphic xmlns:a="http://schemas.openxmlformats.org/drawingml/2006/main">
+              <a:graphicData uri="http://schemas.openxmlformats.org/drawingml/2006/picture">
+                <pic:pic xmlns:pic="http://schemas.openxmlformats.org/drawingml/2006/picture">
+                  <pic:nvPicPr>
+                    <pic:cNvPr id="1500302155" name=""/>
+                    <pic:cNvPicPr/>
+                  </pic:nvPicPr>
+                  <pic:blipFill>
+                    <a:blip r:embed="rId56"/>
+                    <a:stretch>
+                      <a:fillRect/>
+                    </a:stretch>
+                  </pic:blipFill>
+                  <pic:spPr>
+                    <a:xfrm>
+                      <a:off x="0" y="0"/>
+                      <a:ext cx="5731510" cy="4271010"/>
+                    </a:xfrm>
+                    <a:prstGeom prst="rect">
+                      <a:avLst/>
+                    </a:prstGeom>
+                  </pic:spPr>
+                </pic:pic>
+              </a:graphicData>
+            </a:graphic>
+          </wp:inline>
+        </w:drawing>
+      </w:r>
+    </w:p>
+    <w:p>
+      <w:pPr>
+        <w:rPr>
+          <w:rFonts w:hint="eastAsia"/>
+        </w:rPr>
+      </w:pPr>
     </w:p>
     <w:p/>
     <w:p/>
@@ -1858,15 +2664,6 @@
     <w:p/>
     <w:p/>
     <w:p/>
-    <w:p/>
-    <w:p/>
-    <w:p>
-      <w:pPr>
-        <w:rPr>
-          <w:rFonts w:hint="eastAsia"/>
-        </w:rPr>
-      </w:pPr>
-    </w:p>
     <w:sectPr>
       <w:pgSz w:w="11906" w:h="16838"/>
       <w:pgMar w:top="1440" w:right="1440" w:bottom="1440" w:left="1440" w:header="720" w:footer="720" w:gutter="0"/>
@@ -1939,7 +2736,7 @@
       <w:lvlText w:val="%1."/>
       <w:lvlJc w:val="left"/>
       <w:pPr>
-        <w:ind w:left="360" w:hanging="360"/>
+        <w:ind w:left="502" w:hanging="360"/>
       </w:pPr>
       <w:rPr>
         <w:rFonts w:hint="default"/>
@@ -2630,7 +3427,6 @@
   <w:style w:type="character" w:default="1" w:styleId="a0">
     <w:name w:val="Default Paragraph Font"/>
     <w:uiPriority w:val="1"/>
-    <w:semiHidden/>
     <w:unhideWhenUsed/>
   </w:style>
   <w:style w:type="table" w:default="1" w:styleId="a1">

</xml_diff>